<commit_message>
Date: 09 Mar 2026
</commit_message>
<xml_diff>
--- a/Assignments_SA2512006.docx
+++ b/Assignments_SA2512006.docx
@@ -87,6 +87,27 @@
     </w:p>
     <w:p>
       <w:pPr>
+        <w:rPr>
+          <w:b/>
+          <w:bCs/>
+          <w:sz w:val="24"/>
+          <w:szCs w:val="22"/>
+          <w:lang w:val="en-US"/>
+        </w:rPr>
+      </w:pPr>
+      <w:r>
+        <w:rPr>
+          <w:b/>
+          <w:bCs/>
+          <w:sz w:val="24"/>
+          <w:szCs w:val="22"/>
+          <w:lang w:val="en-US"/>
+        </w:rPr>
+        <w:t>Date: 09 March 2026</w:t>
+      </w:r>
+    </w:p>
+    <w:p>
+      <w:pPr>
         <w:pStyle w:val="ListParagraph"/>
         <w:numPr>
           <w:ilvl w:val="0"/>
@@ -98,8 +119,834 @@
           <w:lang w:val="en-US"/>
         </w:rPr>
       </w:pPr>
+      <w:r>
+        <w:rPr>
+          <w:sz w:val="24"/>
+          <w:szCs w:val="22"/>
+          <w:lang w:val="en-US"/>
+        </w:rPr>
+        <w:t xml:space="preserve">Launch </w:t>
+      </w:r>
+      <w:hyperlink r:id="rId5" w:history="1">
+        <w:r>
+          <w:rPr>
+            <w:rStyle w:val="Hyperlink"/>
+            <w:sz w:val="24"/>
+            <w:szCs w:val="22"/>
+            <w:lang w:val="en-US"/>
+          </w:rPr>
+          <w:t>https://www.echotrak.com/Login.aspx?ReturnUrl=%2f</w:t>
+        </w:r>
+      </w:hyperlink>
+    </w:p>
+    <w:p>
+      <w:pPr>
+        <w:pStyle w:val="ListParagraph"/>
+        <w:numPr>
+          <w:ilvl w:val="1"/>
+          <w:numId w:val="1"/>
+        </w:numPr>
+        <w:rPr>
+          <w:sz w:val="24"/>
+          <w:szCs w:val="22"/>
+          <w:lang w:val="en-US"/>
+        </w:rPr>
+      </w:pPr>
+      <w:r>
+        <w:rPr>
+          <w:sz w:val="24"/>
+          <w:szCs w:val="22"/>
+          <w:lang w:val="en-US"/>
+        </w:rPr>
+        <w:t>Enter user name (as your name)</w:t>
+      </w:r>
+    </w:p>
+    <w:p>
+      <w:pPr>
+        <w:pStyle w:val="ListParagraph"/>
+        <w:numPr>
+          <w:ilvl w:val="1"/>
+          <w:numId w:val="1"/>
+        </w:numPr>
+        <w:rPr>
+          <w:sz w:val="24"/>
+          <w:szCs w:val="22"/>
+          <w:lang w:val="en-US"/>
+        </w:rPr>
+      </w:pPr>
+      <w:r>
+        <w:rPr>
+          <w:sz w:val="24"/>
+          <w:szCs w:val="22"/>
+          <w:lang w:val="en-US"/>
+        </w:rPr>
+        <w:t>Enter password (as your name)</w:t>
+      </w:r>
+    </w:p>
+    <w:p>
+      <w:pPr>
+        <w:pStyle w:val="ListParagraph"/>
+        <w:numPr>
+          <w:ilvl w:val="1"/>
+          <w:numId w:val="1"/>
+        </w:numPr>
+        <w:rPr>
+          <w:sz w:val="24"/>
+          <w:szCs w:val="22"/>
+          <w:lang w:val="en-US"/>
+        </w:rPr>
+      </w:pPr>
+      <w:r>
+        <w:rPr>
+          <w:sz w:val="24"/>
+          <w:szCs w:val="22"/>
+          <w:lang w:val="en-US"/>
+        </w:rPr>
+        <w:t>Click on Login button</w:t>
+      </w:r>
+    </w:p>
+    <w:p>
+      <w:pPr>
+        <w:pStyle w:val="ListParagraph"/>
+        <w:numPr>
+          <w:ilvl w:val="1"/>
+          <w:numId w:val="1"/>
+        </w:numPr>
+        <w:rPr>
+          <w:sz w:val="24"/>
+          <w:szCs w:val="22"/>
+          <w:lang w:val="en-US"/>
+        </w:rPr>
+      </w:pPr>
+      <w:r>
+        <w:rPr>
+          <w:sz w:val="24"/>
+          <w:szCs w:val="22"/>
+          <w:lang w:val="en-US"/>
+        </w:rPr>
+        <w:t>Display error message</w:t>
+      </w:r>
+      <w:r>
+        <w:rPr>
+          <w:sz w:val="24"/>
+          <w:szCs w:val="22"/>
+          <w:lang w:val="en-US"/>
+        </w:rPr>
+        <w:br/>
+      </w:r>
+      <w:r>
+        <w:rPr>
+          <w:b/>
+          <w:bCs/>
+          <w:sz w:val="24"/>
+          <w:szCs w:val="22"/>
+          <w:lang w:val="en-US"/>
+        </w:rPr>
+        <w:t>Use Id Locator</w:t>
+      </w:r>
+    </w:p>
+    <w:p>
+      <w:pPr>
+        <w:pStyle w:val="ListParagraph"/>
+        <w:numPr>
+          <w:ilvl w:val="0"/>
+          <w:numId w:val="1"/>
+        </w:numPr>
+        <w:rPr>
+          <w:sz w:val="24"/>
+          <w:szCs w:val="22"/>
+          <w:lang w:val="en-US"/>
+        </w:rPr>
+      </w:pPr>
+      <w:r>
+        <w:rPr>
+          <w:sz w:val="24"/>
+          <w:szCs w:val="22"/>
+          <w:lang w:val="en-US"/>
+        </w:rPr>
+        <w:t xml:space="preserve">Launch </w:t>
+      </w:r>
+      <w:hyperlink r:id="rId6" w:history="1">
+        <w:r>
+          <w:rPr>
+            <w:rStyle w:val="Hyperlink"/>
+            <w:sz w:val="24"/>
+            <w:szCs w:val="22"/>
+            <w:lang w:val="en-US"/>
+          </w:rPr>
+          <w:t>https://www.echotrak.com/Login.aspx?ReturnUrl=%2f</w:t>
+        </w:r>
+      </w:hyperlink>
+    </w:p>
+    <w:p>
+      <w:pPr>
+        <w:pStyle w:val="ListParagraph"/>
+        <w:numPr>
+          <w:ilvl w:val="1"/>
+          <w:numId w:val="1"/>
+        </w:numPr>
+        <w:rPr>
+          <w:sz w:val="24"/>
+          <w:szCs w:val="22"/>
+          <w:lang w:val="en-US"/>
+        </w:rPr>
+      </w:pPr>
+      <w:r>
+        <w:rPr>
+          <w:sz w:val="24"/>
+          <w:szCs w:val="22"/>
+          <w:lang w:val="en-US"/>
+        </w:rPr>
+        <w:t>Enter user name (as your name)</w:t>
+      </w:r>
+    </w:p>
+    <w:p>
+      <w:pPr>
+        <w:pStyle w:val="ListParagraph"/>
+        <w:numPr>
+          <w:ilvl w:val="1"/>
+          <w:numId w:val="1"/>
+        </w:numPr>
+        <w:rPr>
+          <w:sz w:val="24"/>
+          <w:szCs w:val="22"/>
+          <w:lang w:val="en-US"/>
+        </w:rPr>
+      </w:pPr>
+      <w:r>
+        <w:rPr>
+          <w:sz w:val="24"/>
+          <w:szCs w:val="22"/>
+          <w:lang w:val="en-US"/>
+        </w:rPr>
+        <w:t>Enter password (as your name)</w:t>
+      </w:r>
+    </w:p>
+    <w:p>
+      <w:pPr>
+        <w:pStyle w:val="ListParagraph"/>
+        <w:numPr>
+          <w:ilvl w:val="1"/>
+          <w:numId w:val="1"/>
+        </w:numPr>
+        <w:rPr>
+          <w:sz w:val="24"/>
+          <w:szCs w:val="22"/>
+          <w:lang w:val="en-US"/>
+        </w:rPr>
+      </w:pPr>
+      <w:r>
+        <w:rPr>
+          <w:sz w:val="24"/>
+          <w:szCs w:val="22"/>
+          <w:lang w:val="en-US"/>
+        </w:rPr>
+        <w:t>Click on Login button</w:t>
+      </w:r>
+    </w:p>
+    <w:p>
+      <w:pPr>
+        <w:pStyle w:val="ListParagraph"/>
+        <w:numPr>
+          <w:ilvl w:val="1"/>
+          <w:numId w:val="1"/>
+        </w:numPr>
+        <w:rPr>
+          <w:sz w:val="24"/>
+          <w:szCs w:val="22"/>
+          <w:lang w:val="en-US"/>
+        </w:rPr>
+      </w:pPr>
+      <w:r>
+        <w:rPr>
+          <w:sz w:val="24"/>
+          <w:szCs w:val="22"/>
+          <w:lang w:val="en-US"/>
+        </w:rPr>
+        <w:t>Display error message</w:t>
+      </w:r>
+      <w:r>
+        <w:rPr>
+          <w:sz w:val="24"/>
+          <w:szCs w:val="22"/>
+          <w:lang w:val="en-US"/>
+        </w:rPr>
+        <w:br/>
+      </w:r>
+      <w:r>
+        <w:rPr>
+          <w:b/>
+          <w:bCs/>
+          <w:sz w:val="24"/>
+          <w:szCs w:val="22"/>
+          <w:lang w:val="en-US"/>
+        </w:rPr>
+        <w:t>Use Name Locator</w:t>
+      </w:r>
+    </w:p>
+    <w:p>
+      <w:pPr>
+        <w:pStyle w:val="ListParagraph"/>
+        <w:numPr>
+          <w:ilvl w:val="0"/>
+          <w:numId w:val="1"/>
+        </w:numPr>
+        <w:rPr>
+          <w:sz w:val="24"/>
+          <w:szCs w:val="22"/>
+          <w:highlight w:val="yellow"/>
+          <w:lang w:val="en-US"/>
+        </w:rPr>
+      </w:pPr>
+      <w:r>
+        <w:rPr>
+          <w:sz w:val="24"/>
+          <w:szCs w:val="22"/>
+          <w:highlight w:val="yellow"/>
+          <w:lang w:val="en-US"/>
+        </w:rPr>
+        <w:t xml:space="preserve">Launch </w:t>
+      </w:r>
+      <w:hyperlink r:id="rId7" w:history="1">
+        <w:r>
+          <w:rPr>
+            <w:rStyle w:val="Hyperlink"/>
+            <w:sz w:val="24"/>
+            <w:szCs w:val="22"/>
+            <w:highlight w:val="yellow"/>
+            <w:lang w:val="en-US"/>
+          </w:rPr>
+          <w:t>https://register.rediff.com/register/register.php?FormName=user_details</w:t>
+        </w:r>
+      </w:hyperlink>
+    </w:p>
+    <w:p>
+      <w:pPr>
+        <w:pStyle w:val="ListParagraph"/>
+        <w:numPr>
+          <w:ilvl w:val="1"/>
+          <w:numId w:val="1"/>
+        </w:numPr>
+        <w:rPr>
+          <w:sz w:val="24"/>
+          <w:szCs w:val="22"/>
+          <w:highlight w:val="yellow"/>
+          <w:lang w:val="en-US"/>
+        </w:rPr>
+      </w:pPr>
+      <w:r>
+        <w:rPr>
+          <w:sz w:val="24"/>
+          <w:szCs w:val="22"/>
+          <w:highlight w:val="yellow"/>
+          <w:lang w:val="en-US"/>
+        </w:rPr>
+        <w:t>Enter Full Name</w:t>
+      </w:r>
+    </w:p>
+    <w:p>
+      <w:pPr>
+        <w:pStyle w:val="ListParagraph"/>
+        <w:numPr>
+          <w:ilvl w:val="1"/>
+          <w:numId w:val="1"/>
+        </w:numPr>
+        <w:rPr>
+          <w:sz w:val="24"/>
+          <w:szCs w:val="22"/>
+          <w:highlight w:val="yellow"/>
+          <w:lang w:val="en-US"/>
+        </w:rPr>
+      </w:pPr>
+      <w:r>
+        <w:rPr>
+          <w:sz w:val="24"/>
+          <w:szCs w:val="22"/>
+          <w:highlight w:val="yellow"/>
+          <w:lang w:val="en-US"/>
+        </w:rPr>
+        <w:t>Enter Rediff id</w:t>
+      </w:r>
+    </w:p>
+    <w:p>
+      <w:pPr>
+        <w:pStyle w:val="ListParagraph"/>
+        <w:numPr>
+          <w:ilvl w:val="1"/>
+          <w:numId w:val="1"/>
+        </w:numPr>
+        <w:rPr>
+          <w:sz w:val="24"/>
+          <w:szCs w:val="22"/>
+          <w:highlight w:val="yellow"/>
+          <w:lang w:val="en-US"/>
+        </w:rPr>
+      </w:pPr>
+      <w:r>
+        <w:rPr>
+          <w:sz w:val="24"/>
+          <w:szCs w:val="22"/>
+          <w:highlight w:val="yellow"/>
+          <w:lang w:val="en-US"/>
+        </w:rPr>
+        <w:t>Enter password</w:t>
+      </w:r>
+    </w:p>
+    <w:p>
+      <w:pPr>
+        <w:pStyle w:val="ListParagraph"/>
+        <w:numPr>
+          <w:ilvl w:val="1"/>
+          <w:numId w:val="1"/>
+        </w:numPr>
+        <w:rPr>
+          <w:sz w:val="24"/>
+          <w:szCs w:val="22"/>
+          <w:highlight w:val="yellow"/>
+          <w:lang w:val="en-US"/>
+        </w:rPr>
+      </w:pPr>
+      <w:r>
+        <w:rPr>
+          <w:sz w:val="24"/>
+          <w:szCs w:val="22"/>
+          <w:highlight w:val="yellow"/>
+          <w:lang w:val="en-US"/>
+        </w:rPr>
+        <w:t>Enter Retype password</w:t>
+      </w:r>
+      <w:r>
+        <w:rPr>
+          <w:sz w:val="24"/>
+          <w:szCs w:val="22"/>
+          <w:highlight w:val="yellow"/>
+          <w:lang w:val="en-US"/>
+        </w:rPr>
+        <w:br/>
+      </w:r>
+      <w:r>
+        <w:rPr>
+          <w:b/>
+          <w:bCs/>
+          <w:sz w:val="24"/>
+          <w:szCs w:val="22"/>
+          <w:highlight w:val="yellow"/>
+          <w:lang w:val="en-US"/>
+        </w:rPr>
+        <w:t>Use Name / Id locator</w:t>
+      </w:r>
+    </w:p>
+    <w:p>
+      <w:pPr>
+        <w:pStyle w:val="ListParagraph"/>
+        <w:numPr>
+          <w:ilvl w:val="0"/>
+          <w:numId w:val="1"/>
+        </w:numPr>
+        <w:rPr>
+          <w:sz w:val="24"/>
+          <w:szCs w:val="22"/>
+          <w:highlight w:val="yellow"/>
+          <w:lang w:val="en-US"/>
+        </w:rPr>
+      </w:pPr>
+      <w:r>
+        <w:rPr>
+          <w:sz w:val="24"/>
+          <w:szCs w:val="22"/>
+          <w:highlight w:val="yellow"/>
+          <w:lang w:val="en-US"/>
+        </w:rPr>
+        <w:t xml:space="preserve">Launch </w:t>
+      </w:r>
+      <w:hyperlink r:id="rId8" w:history="1">
+        <w:r>
+          <w:rPr>
+            <w:rStyle w:val="Hyperlink"/>
+            <w:sz w:val="24"/>
+            <w:szCs w:val="22"/>
+            <w:highlight w:val="yellow"/>
+            <w:lang w:val="en-US"/>
+          </w:rPr>
+          <w:t>https://www.echotrak.com/Login.aspx?ReturnUrl=%2f</w:t>
+        </w:r>
+      </w:hyperlink>
+    </w:p>
+    <w:p>
+      <w:pPr>
+        <w:pStyle w:val="ListParagraph"/>
+        <w:numPr>
+          <w:ilvl w:val="1"/>
+          <w:numId w:val="1"/>
+        </w:numPr>
+        <w:rPr>
+          <w:sz w:val="24"/>
+          <w:szCs w:val="22"/>
+          <w:highlight w:val="yellow"/>
+          <w:lang w:val="en-US"/>
+        </w:rPr>
+      </w:pPr>
+      <w:r>
+        <w:rPr>
+          <w:sz w:val="24"/>
+          <w:szCs w:val="22"/>
+          <w:highlight w:val="yellow"/>
+          <w:lang w:val="en-US"/>
+        </w:rPr>
+        <w:t>Enter user name (as your name)</w:t>
+      </w:r>
+    </w:p>
+    <w:p>
+      <w:pPr>
+        <w:pStyle w:val="ListParagraph"/>
+        <w:numPr>
+          <w:ilvl w:val="1"/>
+          <w:numId w:val="1"/>
+        </w:numPr>
+        <w:rPr>
+          <w:sz w:val="24"/>
+          <w:szCs w:val="22"/>
+          <w:highlight w:val="yellow"/>
+          <w:lang w:val="en-US"/>
+        </w:rPr>
+      </w:pPr>
+      <w:r>
+        <w:rPr>
+          <w:sz w:val="24"/>
+          <w:szCs w:val="22"/>
+          <w:highlight w:val="yellow"/>
+          <w:lang w:val="en-US"/>
+        </w:rPr>
+        <w:t>Enter password (as your name)</w:t>
+      </w:r>
+    </w:p>
+    <w:p>
+      <w:pPr>
+        <w:pStyle w:val="ListParagraph"/>
+        <w:numPr>
+          <w:ilvl w:val="1"/>
+          <w:numId w:val="1"/>
+        </w:numPr>
+        <w:rPr>
+          <w:sz w:val="24"/>
+          <w:szCs w:val="22"/>
+          <w:highlight w:val="yellow"/>
+          <w:lang w:val="en-US"/>
+        </w:rPr>
+      </w:pPr>
+      <w:r>
+        <w:rPr>
+          <w:sz w:val="24"/>
+          <w:szCs w:val="22"/>
+          <w:highlight w:val="yellow"/>
+          <w:lang w:val="en-US"/>
+        </w:rPr>
+        <w:t>Click on Login button</w:t>
+      </w:r>
+    </w:p>
+    <w:p>
+      <w:pPr>
+        <w:pStyle w:val="ListParagraph"/>
+        <w:numPr>
+          <w:ilvl w:val="1"/>
+          <w:numId w:val="1"/>
+        </w:numPr>
+        <w:rPr>
+          <w:sz w:val="24"/>
+          <w:szCs w:val="22"/>
+          <w:highlight w:val="yellow"/>
+          <w:lang w:val="en-US"/>
+        </w:rPr>
+      </w:pPr>
+      <w:r>
+        <w:rPr>
+          <w:sz w:val="24"/>
+          <w:szCs w:val="22"/>
+          <w:highlight w:val="yellow"/>
+          <w:lang w:val="en-US"/>
+        </w:rPr>
+        <w:t>Display error message</w:t>
+      </w:r>
+      <w:r>
+        <w:rPr>
+          <w:sz w:val="24"/>
+          <w:szCs w:val="22"/>
+          <w:highlight w:val="yellow"/>
+          <w:lang w:val="en-US"/>
+        </w:rPr>
+        <w:br/>
+      </w:r>
+      <w:r>
+        <w:rPr>
+          <w:b/>
+          <w:bCs/>
+          <w:sz w:val="24"/>
+          <w:szCs w:val="22"/>
+          <w:highlight w:val="yellow"/>
+          <w:lang w:val="en-US"/>
+        </w:rPr>
+        <w:t>Use ClassName Locator</w:t>
+      </w:r>
+    </w:p>
+    <w:p>
+      <w:pPr>
+        <w:pStyle w:val="ListParagraph"/>
+        <w:numPr>
+          <w:ilvl w:val="0"/>
+          <w:numId w:val="1"/>
+        </w:numPr>
+        <w:rPr>
+          <w:sz w:val="24"/>
+          <w:szCs w:val="22"/>
+          <w:highlight w:val="yellow"/>
+          <w:lang w:val="en-US"/>
+        </w:rPr>
+      </w:pPr>
+      <w:r>
+        <w:rPr>
+          <w:sz w:val="24"/>
+          <w:szCs w:val="22"/>
+          <w:highlight w:val="yellow"/>
+          <w:lang w:val="en-US"/>
+        </w:rPr>
+        <w:t>Launch facebook.com</w:t>
+      </w:r>
+    </w:p>
+    <w:p>
+      <w:pPr>
+        <w:pStyle w:val="ListParagraph"/>
+        <w:numPr>
+          <w:ilvl w:val="1"/>
+          <w:numId w:val="1"/>
+        </w:numPr>
+        <w:rPr>
+          <w:sz w:val="24"/>
+          <w:szCs w:val="22"/>
+          <w:highlight w:val="yellow"/>
+          <w:lang w:val="en-US"/>
+        </w:rPr>
+      </w:pPr>
+      <w:r>
+        <w:rPr>
+          <w:sz w:val="24"/>
+          <w:szCs w:val="22"/>
+          <w:highlight w:val="yellow"/>
+          <w:lang w:val="en-US"/>
+        </w:rPr>
+        <w:t xml:space="preserve">Enter user name as </w:t>
+      </w:r>
+      <w:hyperlink r:id="rId9" w:history="1">
+        <w:r>
+          <w:rPr>
+            <w:rStyle w:val="Hyperlink"/>
+            <w:sz w:val="24"/>
+            <w:szCs w:val="22"/>
+            <w:highlight w:val="yellow"/>
+            <w:lang w:val="en-US"/>
+          </w:rPr>
+          <w:t>test@gmail.com</w:t>
+        </w:r>
+      </w:hyperlink>
+    </w:p>
+    <w:p>
+      <w:pPr>
+        <w:pStyle w:val="ListParagraph"/>
+        <w:numPr>
+          <w:ilvl w:val="1"/>
+          <w:numId w:val="1"/>
+        </w:numPr>
+        <w:rPr>
+          <w:sz w:val="24"/>
+          <w:szCs w:val="22"/>
+          <w:highlight w:val="yellow"/>
+          <w:lang w:val="en-US"/>
+        </w:rPr>
+      </w:pPr>
+      <w:r>
+        <w:rPr>
+          <w:sz w:val="24"/>
+          <w:szCs w:val="22"/>
+          <w:highlight w:val="yellow"/>
+          <w:lang w:val="en-US"/>
+        </w:rPr>
+        <w:t>Enter password as test@123</w:t>
+      </w:r>
+    </w:p>
+    <w:p>
+      <w:pPr>
+        <w:pStyle w:val="ListParagraph"/>
+        <w:numPr>
+          <w:ilvl w:val="1"/>
+          <w:numId w:val="1"/>
+        </w:numPr>
+        <w:rPr>
+          <w:b/>
+          <w:bCs/>
+          <w:sz w:val="24"/>
+          <w:szCs w:val="22"/>
+          <w:highlight w:val="yellow"/>
+          <w:lang w:val="en-US"/>
+        </w:rPr>
+      </w:pPr>
+      <w:r>
+        <w:rPr>
+          <w:sz w:val="24"/>
+          <w:szCs w:val="22"/>
+          <w:highlight w:val="yellow"/>
+          <w:lang w:val="en-US"/>
+        </w:rPr>
+        <w:t>Click on Login button</w:t>
+      </w:r>
+      <w:r>
+        <w:rPr>
+          <w:sz w:val="24"/>
+          <w:szCs w:val="22"/>
+          <w:highlight w:val="yellow"/>
+          <w:lang w:val="en-US"/>
+        </w:rPr>
+        <w:br/>
+      </w:r>
+      <w:r>
+        <w:rPr>
+          <w:b/>
+          <w:bCs/>
+          <w:sz w:val="24"/>
+          <w:szCs w:val="22"/>
+          <w:highlight w:val="yellow"/>
+          <w:lang w:val="en-US"/>
+        </w:rPr>
+        <w:t>Use ClassName locator</w:t>
+      </w:r>
+    </w:p>
+    <w:p>
+      <w:pPr>
+        <w:pStyle w:val="ListParagraph"/>
+        <w:numPr>
+          <w:ilvl w:val="0"/>
+          <w:numId w:val="1"/>
+        </w:numPr>
+        <w:rPr>
+          <w:sz w:val="24"/>
+          <w:szCs w:val="22"/>
+          <w:lang w:val="en-US"/>
+        </w:rPr>
+      </w:pPr>
+      <w:r>
+        <w:rPr>
+          <w:sz w:val="24"/>
+          <w:szCs w:val="22"/>
+          <w:lang w:val="en-US"/>
+        </w:rPr>
+        <w:t>Launch google.com</w:t>
+      </w:r>
+    </w:p>
+    <w:p>
+      <w:pPr>
+        <w:pStyle w:val="ListParagraph"/>
+        <w:numPr>
+          <w:ilvl w:val="1"/>
+          <w:numId w:val="1"/>
+        </w:numPr>
+        <w:rPr>
+          <w:sz w:val="24"/>
+          <w:szCs w:val="22"/>
+          <w:lang w:val="en-US"/>
+        </w:rPr>
+      </w:pPr>
+      <w:r>
+        <w:rPr>
+          <w:sz w:val="24"/>
+          <w:szCs w:val="22"/>
+          <w:lang w:val="en-US"/>
+        </w:rPr>
+        <w:t>Enter Pattankodoli Yatra</w:t>
+      </w:r>
+    </w:p>
+    <w:p>
+      <w:pPr>
+        <w:pStyle w:val="ListParagraph"/>
+        <w:numPr>
+          <w:ilvl w:val="1"/>
+          <w:numId w:val="1"/>
+        </w:numPr>
+        <w:rPr>
+          <w:sz w:val="24"/>
+          <w:szCs w:val="22"/>
+          <w:lang w:val="en-US"/>
+        </w:rPr>
+      </w:pPr>
+      <w:r>
+        <w:rPr>
+          <w:sz w:val="24"/>
+          <w:szCs w:val="22"/>
+          <w:lang w:val="en-US"/>
+        </w:rPr>
+        <w:t>Hit Enter</w:t>
+      </w:r>
+    </w:p>
+    <w:p>
+      <w:pPr>
+        <w:rPr>
+          <w:sz w:val="24"/>
+          <w:szCs w:val="22"/>
+          <w:lang w:val="en-US"/>
+        </w:rPr>
+      </w:pPr>
+    </w:p>
+    <w:p>
+      <w:pPr>
+        <w:rPr>
+          <w:b/>
+          <w:bCs/>
+          <w:sz w:val="24"/>
+          <w:szCs w:val="22"/>
+          <w:lang w:val="en-US"/>
+        </w:rPr>
+      </w:pPr>
+      <w:r>
+        <w:rPr>
+          <w:b/>
+          <w:bCs/>
+          <w:sz w:val="24"/>
+          <w:szCs w:val="22"/>
+          <w:lang w:val="en-US"/>
+        </w:rPr>
+        <w:t>Date:</w:t>
+      </w:r>
       <w:bookmarkStart w:id="0" w:name="_GoBack"/>
       <w:bookmarkEnd w:id="0"/>
+    </w:p>
+    <w:p>
+      <w:pPr>
+        <w:rPr>
+          <w:sz w:val="24"/>
+          <w:szCs w:val="22"/>
+          <w:lang w:val="en-US"/>
+        </w:rPr>
+      </w:pPr>
+    </w:p>
+    <w:p>
+      <w:pPr>
+        <w:pStyle w:val="ListParagraph"/>
+        <w:numPr>
+          <w:ilvl w:val="0"/>
+          <w:numId w:val="1"/>
+        </w:numPr>
+        <w:rPr>
+          <w:sz w:val="24"/>
+          <w:szCs w:val="22"/>
+          <w:lang w:val="en-US"/>
+        </w:rPr>
+      </w:pPr>
+      <w:r>
+        <w:rPr>
+          <w:sz w:val="24"/>
+          <w:szCs w:val="22"/>
+          <w:lang w:val="en-US"/>
+        </w:rPr>
+        <w:lastRenderedPageBreak/>
+        <w:t>Launch</w:t>
+      </w:r>
     </w:p>
     <w:sectPr>
       <w:pgSz w:w="11906" w:h="16838"/>
@@ -642,6 +1489,17 @@
       <w:contextualSpacing/>
     </w:pPr>
   </w:style>
+  <w:style w:type="character" w:styleId="Hyperlink">
+    <w:name w:val="Hyperlink"/>
+    <w:basedOn w:val="DefaultParagraphFont"/>
+    <w:uiPriority w:val="99"/>
+    <w:unhideWhenUsed/>
+    <w:rsid w:val="003E1C71"/>
+    <w:rPr>
+      <w:color w:val="0563C1" w:themeColor="hyperlink"/>
+      <w:u w:val="single"/>
+    </w:rPr>
+  </w:style>
 </w:styles>
 </file>
 

</xml_diff>

<commit_message>
Date: 19 Mar 2026
</commit_message>
<xml_diff>
--- a/Assignments_SA2512006.docx
+++ b/Assignments_SA2512006.docx
@@ -1409,25 +1409,7 @@
           <w:szCs w:val="24"/>
           <w:lang w:val="en-US"/>
         </w:rPr>
-        <w:t xml:space="preserve">Display the status of all 7 checkboxes (Monday, Tuesday </w:t>
-      </w:r>
-      <w:proofErr w:type="spellStart"/>
-      <w:r>
-        <w:rPr>
-          <w:sz w:val="24"/>
-          <w:szCs w:val="24"/>
-          <w:lang w:val="en-US"/>
-        </w:rPr>
-        <w:t>etc</w:t>
-      </w:r>
-      <w:proofErr w:type="spellEnd"/>
-      <w:r>
-        <w:rPr>
-          <w:sz w:val="24"/>
-          <w:szCs w:val="24"/>
-          <w:lang w:val="en-US"/>
-        </w:rPr>
-        <w:t>)</w:t>
+        <w:t>Display the status of all 7 checkboxes (Monday, Tuesday etc)</w:t>
       </w:r>
     </w:p>
     <w:p>
@@ -1968,27 +1950,7 @@
           <w:highlight w:val="yellow"/>
           <w:lang w:val="en-US"/>
         </w:rPr>
-        <w:t xml:space="preserve">Enter first 4 characters from your city (Kolhapur – </w:t>
-      </w:r>
-      <w:proofErr w:type="spellStart"/>
-      <w:r>
-        <w:rPr>
-          <w:sz w:val="24"/>
-          <w:szCs w:val="24"/>
-          <w:highlight w:val="yellow"/>
-          <w:lang w:val="en-US"/>
-        </w:rPr>
-        <w:t>kolh</w:t>
-      </w:r>
-      <w:proofErr w:type="spellEnd"/>
-      <w:r>
-        <w:rPr>
-          <w:sz w:val="24"/>
-          <w:szCs w:val="24"/>
-          <w:highlight w:val="yellow"/>
-          <w:lang w:val="en-US"/>
-        </w:rPr>
-        <w:t>)</w:t>
+        <w:t>Enter first 4 characters from your city (Kolhapur – kolh)</w:t>
       </w:r>
     </w:p>
     <w:p>
@@ -2539,25 +2501,7 @@
           <w:szCs w:val="22"/>
           <w:lang w:val="en-US"/>
         </w:rPr>
-        <w:t xml:space="preserve">Complete </w:t>
-      </w:r>
-      <w:proofErr w:type="spellStart"/>
-      <w:r>
-        <w:rPr>
-          <w:sz w:val="24"/>
-          <w:szCs w:val="22"/>
-          <w:lang w:val="en-US"/>
-        </w:rPr>
-        <w:t>orangehrm</w:t>
-      </w:r>
-      <w:proofErr w:type="spellEnd"/>
-      <w:r>
-        <w:rPr>
-          <w:sz w:val="24"/>
-          <w:szCs w:val="22"/>
-          <w:lang w:val="en-US"/>
-        </w:rPr>
-        <w:t xml:space="preserve"> login logout using Explicit Wait</w:t>
+        <w:t>Complete orangehrm login logout using Explicit Wait</w:t>
       </w:r>
     </w:p>
     <w:p>
@@ -3606,19 +3550,8 @@
           <w:highlight w:val="yellow"/>
           <w:lang w:val="en-US"/>
         </w:rPr>
-        <w:t xml:space="preserve">Login using data provided in step no h &amp; </w:t>
-      </w:r>
-      <w:proofErr w:type="spellStart"/>
-      <w:r>
-        <w:rPr>
-          <w:sz w:val="24"/>
-          <w:szCs w:val="24"/>
-          <w:highlight w:val="yellow"/>
-          <w:lang w:val="en-US"/>
-        </w:rPr>
-        <w:t>i</w:t>
-      </w:r>
-      <w:proofErr w:type="spellEnd"/>
+        <w:t>Login using data provided in step no h &amp; i</w:t>
+      </w:r>
     </w:p>
     <w:p>
       <w:pPr>
@@ -4110,25 +4043,7 @@
           <w:szCs w:val="24"/>
           <w:lang w:val="en-US"/>
         </w:rPr>
-        <w:t xml:space="preserve">Click on </w:t>
-      </w:r>
-      <w:proofErr w:type="spellStart"/>
-      <w:r>
-        <w:rPr>
-          <w:sz w:val="24"/>
-          <w:szCs w:val="24"/>
-          <w:lang w:val="en-US"/>
-        </w:rPr>
-        <w:t>ClickToGetAlert</w:t>
-      </w:r>
-      <w:proofErr w:type="spellEnd"/>
-      <w:r>
-        <w:rPr>
-          <w:sz w:val="24"/>
-          <w:szCs w:val="24"/>
-          <w:lang w:val="en-US"/>
-        </w:rPr>
-        <w:t xml:space="preserve"> button</w:t>
+        <w:t>Click on ClickToGetAlert button</w:t>
       </w:r>
     </w:p>
     <w:p>
@@ -4197,25 +4112,7 @@
           <w:szCs w:val="24"/>
           <w:lang w:val="en-US"/>
         </w:rPr>
-        <w:t xml:space="preserve">Click on </w:t>
-      </w:r>
-      <w:proofErr w:type="spellStart"/>
-      <w:r>
-        <w:rPr>
-          <w:sz w:val="24"/>
-          <w:szCs w:val="24"/>
-          <w:lang w:val="en-US"/>
-        </w:rPr>
-        <w:t>GetPrompt</w:t>
-      </w:r>
-      <w:proofErr w:type="spellEnd"/>
-      <w:r>
-        <w:rPr>
-          <w:sz w:val="24"/>
-          <w:szCs w:val="24"/>
-          <w:lang w:val="en-US"/>
-        </w:rPr>
-        <w:t xml:space="preserve"> Button</w:t>
+        <w:t>Click on GetPrompt Button</w:t>
       </w:r>
     </w:p>
     <w:p>
@@ -4284,25 +4181,7 @@
           <w:szCs w:val="24"/>
           <w:lang w:val="en-US"/>
         </w:rPr>
-        <w:t xml:space="preserve">Click on </w:t>
-      </w:r>
-      <w:proofErr w:type="spellStart"/>
-      <w:r>
-        <w:rPr>
-          <w:sz w:val="24"/>
-          <w:szCs w:val="24"/>
-          <w:lang w:val="en-US"/>
-        </w:rPr>
-        <w:t>GetConfirmation</w:t>
-      </w:r>
-      <w:proofErr w:type="spellEnd"/>
-      <w:r>
-        <w:rPr>
-          <w:sz w:val="24"/>
-          <w:szCs w:val="24"/>
-          <w:lang w:val="en-US"/>
-        </w:rPr>
-        <w:t xml:space="preserve"> Button </w:t>
+        <w:t xml:space="preserve">Click on GetConfirmation Button </w:t>
       </w:r>
     </w:p>
     <w:p>
@@ -4709,27 +4588,7 @@
             <w:szCs w:val="24"/>
             <w:lang w:val="en-US"/>
           </w:rPr>
-          <w:t>https://www.jotfo</w:t>
-        </w:r>
-        <w:bookmarkStart w:id="0" w:name="_GoBack"/>
-        <w:bookmarkEnd w:id="0"/>
-        <w:r>
-          <w:rPr>
-            <w:rStyle w:val="Hyperlink"/>
-            <w:sz w:val="24"/>
-            <w:szCs w:val="24"/>
-            <w:lang w:val="en-US"/>
-          </w:rPr>
-          <w:t>r</w:t>
-        </w:r>
-        <w:r>
-          <w:rPr>
-            <w:rStyle w:val="Hyperlink"/>
-            <w:sz w:val="24"/>
-            <w:szCs w:val="24"/>
-            <w:lang w:val="en-US"/>
-          </w:rPr>
-          <w:t>m.com/form-templates/exam-registration-form</w:t>
+          <w:t>https://www.jotform.com/form-templates/exam-registration-form</w:t>
         </w:r>
       </w:hyperlink>
     </w:p>
@@ -4758,6 +4617,44 @@
     </w:p>
     <w:p>
       <w:pPr>
+        <w:spacing w:line="256" w:lineRule="auto"/>
+        <w:rPr>
+          <w:sz w:val="24"/>
+          <w:szCs w:val="24"/>
+          <w:lang w:val="en-US"/>
+        </w:rPr>
+      </w:pPr>
+    </w:p>
+    <w:p>
+      <w:pPr>
+        <w:spacing w:line="256" w:lineRule="auto"/>
+        <w:rPr>
+          <w:sz w:val="24"/>
+          <w:szCs w:val="24"/>
+          <w:lang w:val="en-US"/>
+        </w:rPr>
+      </w:pPr>
+      <w:r>
+        <w:rPr>
+          <w:sz w:val="24"/>
+          <w:szCs w:val="24"/>
+          <w:lang w:val="en-US"/>
+        </w:rPr>
+        <w:t>Date: 19 March 2026</w:t>
+      </w:r>
+    </w:p>
+    <w:p>
+      <w:pPr>
+        <w:spacing w:line="256" w:lineRule="auto"/>
+        <w:rPr>
+          <w:sz w:val="24"/>
+          <w:szCs w:val="24"/>
+          <w:lang w:val="en-US"/>
+        </w:rPr>
+      </w:pPr>
+    </w:p>
+    <w:p>
+      <w:pPr>
         <w:pStyle w:val="ListParagraph"/>
         <w:numPr>
           <w:ilvl w:val="0"/>
@@ -4769,6 +4666,30 @@
           <w:lang w:val="en-US"/>
         </w:rPr>
       </w:pPr>
+      <w:r>
+        <w:rPr>
+          <w:sz w:val="24"/>
+          <w:szCs w:val="22"/>
+          <w:lang w:val="en-US"/>
+        </w:rPr>
+        <w:t>What is the difference between driver.get() &amp; driver.navigate().to() methods</w:t>
+      </w:r>
+    </w:p>
+    <w:p>
+      <w:pPr>
+        <w:pStyle w:val="ListParagraph"/>
+        <w:numPr>
+          <w:ilvl w:val="0"/>
+          <w:numId w:val="1"/>
+        </w:numPr>
+        <w:rPr>
+          <w:sz w:val="24"/>
+          <w:szCs w:val="22"/>
+          <w:lang w:val="en-US"/>
+        </w:rPr>
+      </w:pPr>
+      <w:bookmarkStart w:id="0" w:name="_GoBack"/>
+      <w:bookmarkEnd w:id="0"/>
     </w:p>
     <w:sectPr>
       <w:pgSz w:w="11906" w:h="16838"/>

</xml_diff>